<commit_message>
Support atomic formatting of locked content controls
</commit_message>
<xml_diff>
--- a/superdoc-inline-revisions/public/review-sample.docx
+++ b/superdoc-inline-revisions/public/review-sample.docx
@@ -14,20 +14,9 @@
       <w:r>
         <w:t xml:space="preserve">This Mutual N</w:t>
       </w:r>
-      <w:sdt>
-        <w:sdtPr>
-          <w:id w:val="560443446"/>
-          <w:alias w:val="Anchored metadata"/>
-          <w:tag w:val="demo-finding-52401a5f-123f-43d6-959c-fe9e1550d6be"/>
-          <w15:appearance w15:val="hidden"/>
-          <w:text/>
-        </w:sdtPr>
-        <w:sdtContent>
-          <w:r>
-            <w:t>on-Disclosure Agreem</w:t>
-          </w:r>
-        </w:sdtContent>
-      </w:sdt>
+      <w:r>
+        <w:t>on-Disclosure Agreem</w:t>
+      </w:r>
       <w:r>
         <w:t>ent (the "Agreement") is entered into as of January 15, 2025 (the "Effective Date"), by and between:</w:t>
       </w:r>
@@ -39,20 +28,9 @@
       <w:r>
         <w:t xml:space="preserve"> Corp, a corporation or</w:t>
       </w:r>
-      <w:sdt>
-        <w:sdtPr>
-          <w:id w:val="1019590873"/>
-          <w:alias w:val="Anchored metadata"/>
-          <w:tag w:val="demo-finding-5e85d667-f45f-483e-b0ba-b417153a563b"/>
-          <w15:appearance w15:val="hidden"/>
-          <w:text/>
-        </w:sdtPr>
-        <w:sdtContent>
-          <w:r>
-            <w:t>ganized under the l</w:t>
-          </w:r>
-        </w:sdtContent>
-      </w:sdt>
+      <w:r>
+        <w:t>ganized under the l</w:t>
+      </w:r>
       <w:r>
         <w:t>aws of the State of Delaware, with its principal office at 200 Tech Boulevard, Suite 400, San Jose, CA 95110 (the "Disclosing Party"), contact: legal@</w:t>
       </w:r>
@@ -100,20 +78,9 @@
       <w:r>
         <w:t>"Confid</w:t>
       </w:r>
-      <w:sdt>
-        <w:sdtPr>
-          <w:id w:val="695390746"/>
-          <w:alias w:val="Anchored metadata"/>
-          <w:tag w:val="demo-finding-6c05ce79-19e5-4e68-b221-2a296e0bfa96"/>
-          <w15:appearance w15:val="hidden"/>
-          <w:text/>
-        </w:sdtPr>
-        <w:sdtContent>
-          <w:r>
-            <w:t>ial Information" means any</w:t>
-          </w:r>
-        </w:sdtContent>
-      </w:sdt>
+      <w:r>
+        <w:t>ial Information" means any</w:t>
+      </w:r>
       <w:r>
         <w:t xml:space="preserve"> proprietary, or confidential information disclosed by either Party to the other Party, whether orally, in writing, or by inspection of tangible objects, including but not limited to: trade secrets, business plans, financial data, customer lists, technical specifications, software code, product roadmaps, and marketing strategies.</w:t>
       </w:r>
@@ -135,20 +102,9 @@
       <w:pPr>
         <w:pStyle w:val="ListBullet"/>
       </w:pPr>
-      <w:sdt>
-        <w:sdtPr>
-          <w:id w:val="715542953"/>
-          <w:alias w:val="Anchored metadata"/>
-          <w:tag w:val="demo-finding-c57f8f8b-602a-4194-a5c2-5f942d9e4d69"/>
-          <w15:appearance w15:val="hidden"/>
-          <w:text/>
-        </w:sdtPr>
-        <w:sdtContent>
-          <w:r>
-            <w:t>Maintain the confidentiality of all Confidential Information using the same degree of care as it uses for its own confidential information, but no less than reasonable care.</w:t>
-          </w:r>
-        </w:sdtContent>
-      </w:sdt>
+      <w:r>
+        <w:t>Maintain the confidentiality of all Confidential Information using the same degree of care as it uses for its own confidential information, but no less than reasonable care.</w:t>
+      </w:r>
     </w:p>
     <w:p>
       <w:pPr>
@@ -224,20 +180,9 @@
       <w:r>
         <w:t xml:space="preserve">Eac</w:t>
       </w:r>
-      <w:sdt>
-        <w:sdtPr>
-          <w:id w:val="26670585"/>
-          <w:alias w:val="Anchored metadata"/>
-          <w:tag w:val="demo-finding-53b868e2-057d-40c0-9c5f-fe3925897d6c"/>
-          <w15:appearance w15:val="hidden"/>
-          <w:text/>
-        </w:sdtPr>
-        <w:sdtContent>
-          <w:r>
-            <w:t>h Party shall mutually indemnify, defend, and hold harmless the other Party from and against any and all claims, damages, losses, costs, and expenses (including reasonable attorneys' fees) arising out of or relating to any breach of this Agreement. The total liability under this section shall not exceed $500,0</w:t>
-          </w:r>
-        </w:sdtContent>
-      </w:sdt>
+      <w:r>
+        <w:t>h Party shall mutually indemnify, defend, and hold harmless the other Party from and against any and all claims, damages, losses, costs, and expenses (including reasonable attorneys' fees) arising out of or relating to any breach of this Agreement. The total liability under this section shall not exceed $500,0</w:t>
+      </w:r>
       <w:r>
         <w:t>00.</w:t>
       </w:r>
@@ -264,20 +209,9 @@
       </w:r>
     </w:p>
     <w:p>
-      <w:sdt>
-        <w:sdtPr>
-          <w:id w:val="1786192645"/>
-          <w:alias w:val="Anchored metadata"/>
-          <w:tag w:val="demo-finding-c3b7f4c2-e661-4a6b-b826-b275400b02ff"/>
-          <w15:appearance w15:val="hidden"/>
-          <w:text/>
-        </w:sdtPr>
-        <w:sdtContent>
-          <w:r>
-            <w:t>This Agreement constitutes the entire agreement between the Parties with respect to the subject matter hereof and supersede prior or contemporaneous agreements, whether written or oral. No amendment to this Agreement shall be effective unless made in writing and signed by both Parties.</w:t>
-          </w:r>
-        </w:sdtContent>
-      </w:sdt>
+      <w:r>
+        <w:t>This Agreement constitutes the entire agreement between the Parties with respect to the subject matter hereof and supersede prior or contemporaneous agreements, whether written or oral. No amendment to this Agreement shall be effective unless made in writing and signed by both Parties.</w:t>
+      </w:r>
     </w:p>
     <w:p/>
     <w:p>
@@ -12215,19 +12149,4 @@
   </a:objectDefaults>
   <a:extraClrSchemeLst/>
 </a:theme>
-</file>
-
-<file path=customXml/item1.xml><?xml version="1.0" encoding="utf-8"?>
-<refs xmlns="urn:superdoc:react-demo:findings">
-  <ref id="demo-finding-52401a5f-123f-43d6-959c-fe9e1550d6be" encoding="json">{"kind":"manual-test","label":"React demo selection","createdAt":"2026-08-17T17:39:18.005Z"}</ref>
-  <ref id="demo-finding-5e85d667-f45f-483e-b0ba-b417153a563b" encoding="json">{"kind":"manual-test","label":"React demo selection","createdAt":"2026-08-17T17:41:03.362Z"}</ref>
-  <ref id="demo-finding-6c05ce79-19e5-4e68-b221-2a296e0bfa96" encoding="json">{"kind":"manual-test","label":"React demo selection","createdAt":"2026-08-17T17:41:22.554Z"}</ref>
-  <ref id="demo-finding-c57f8f8b-602a-4194-a5c2-5f942d9e4d69" encoding="json">{"kind":"manual-test","label":"React demo selection","createdAt":"2026-08-17T17:45:27.033Z"}</ref>
-  <ref id="demo-finding-53b868e2-057d-40c0-9c5f-fe3925897d6c" encoding="json">{"kind":"manual-test","label":"React demo selection","createdAt":"2026-08-17T17:45:48.996Z"}</ref>
-  <ref id="demo-finding-c3b7f4c2-e661-4a6b-b826-b275400b02ff" encoding="json">{"kind":"manual-test","label":"React demo selection","createdAt":"2026-08-17T17:45:55.825Z"}</ref>
-</refs>
-</file>
-
-<file path=customXml/itemProps1.xml><?xml version="1.0" encoding="utf-8"?>
-<ds:datastoreItem xmlns:ds="http://schemas.openxmlformats.org/officeDocument/2006/customXml" ds:itemID="{CD44BF95-29D8-2195-B5E3-2AF1C60111B3}"/>
 </file>
</xml_diff>

<commit_message>
Support atomic formatting of locked content controls (#98)
</commit_message>
<xml_diff>
--- a/superdoc-inline-revisions/public/review-sample.docx
+++ b/superdoc-inline-revisions/public/review-sample.docx
@@ -14,20 +14,9 @@
       <w:r>
         <w:t xml:space="preserve">This Mutual N</w:t>
       </w:r>
-      <w:sdt>
-        <w:sdtPr>
-          <w:id w:val="560443446"/>
-          <w:alias w:val="Anchored metadata"/>
-          <w:tag w:val="demo-finding-52401a5f-123f-43d6-959c-fe9e1550d6be"/>
-          <w15:appearance w15:val="hidden"/>
-          <w:text/>
-        </w:sdtPr>
-        <w:sdtContent>
-          <w:r>
-            <w:t>on-Disclosure Agreem</w:t>
-          </w:r>
-        </w:sdtContent>
-      </w:sdt>
+      <w:r>
+        <w:t>on-Disclosure Agreem</w:t>
+      </w:r>
       <w:r>
         <w:t>ent (the "Agreement") is entered into as of January 15, 2025 (the "Effective Date"), by and between:</w:t>
       </w:r>
@@ -39,20 +28,9 @@
       <w:r>
         <w:t xml:space="preserve"> Corp, a corporation or</w:t>
       </w:r>
-      <w:sdt>
-        <w:sdtPr>
-          <w:id w:val="1019590873"/>
-          <w:alias w:val="Anchored metadata"/>
-          <w:tag w:val="demo-finding-5e85d667-f45f-483e-b0ba-b417153a563b"/>
-          <w15:appearance w15:val="hidden"/>
-          <w:text/>
-        </w:sdtPr>
-        <w:sdtContent>
-          <w:r>
-            <w:t>ganized under the l</w:t>
-          </w:r>
-        </w:sdtContent>
-      </w:sdt>
+      <w:r>
+        <w:t>ganized under the l</w:t>
+      </w:r>
       <w:r>
         <w:t>aws of the State of Delaware, with its principal office at 200 Tech Boulevard, Suite 400, San Jose, CA 95110 (the "Disclosing Party"), contact: legal@</w:t>
       </w:r>
@@ -100,20 +78,9 @@
       <w:r>
         <w:t>"Confid</w:t>
       </w:r>
-      <w:sdt>
-        <w:sdtPr>
-          <w:id w:val="695390746"/>
-          <w:alias w:val="Anchored metadata"/>
-          <w:tag w:val="demo-finding-6c05ce79-19e5-4e68-b221-2a296e0bfa96"/>
-          <w15:appearance w15:val="hidden"/>
-          <w:text/>
-        </w:sdtPr>
-        <w:sdtContent>
-          <w:r>
-            <w:t>ial Information" means any</w:t>
-          </w:r>
-        </w:sdtContent>
-      </w:sdt>
+      <w:r>
+        <w:t>ial Information" means any</w:t>
+      </w:r>
       <w:r>
         <w:t xml:space="preserve"> proprietary, or confidential information disclosed by either Party to the other Party, whether orally, in writing, or by inspection of tangible objects, including but not limited to: trade secrets, business plans, financial data, customer lists, technical specifications, software code, product roadmaps, and marketing strategies.</w:t>
       </w:r>
@@ -135,20 +102,9 @@
       <w:pPr>
         <w:pStyle w:val="ListBullet"/>
       </w:pPr>
-      <w:sdt>
-        <w:sdtPr>
-          <w:id w:val="715542953"/>
-          <w:alias w:val="Anchored metadata"/>
-          <w:tag w:val="demo-finding-c57f8f8b-602a-4194-a5c2-5f942d9e4d69"/>
-          <w15:appearance w15:val="hidden"/>
-          <w:text/>
-        </w:sdtPr>
-        <w:sdtContent>
-          <w:r>
-            <w:t>Maintain the confidentiality of all Confidential Information using the same degree of care as it uses for its own confidential information, but no less than reasonable care.</w:t>
-          </w:r>
-        </w:sdtContent>
-      </w:sdt>
+      <w:r>
+        <w:t>Maintain the confidentiality of all Confidential Information using the same degree of care as it uses for its own confidential information, but no less than reasonable care.</w:t>
+      </w:r>
     </w:p>
     <w:p>
       <w:pPr>
@@ -224,20 +180,9 @@
       <w:r>
         <w:t xml:space="preserve">Eac</w:t>
       </w:r>
-      <w:sdt>
-        <w:sdtPr>
-          <w:id w:val="26670585"/>
-          <w:alias w:val="Anchored metadata"/>
-          <w:tag w:val="demo-finding-53b868e2-057d-40c0-9c5f-fe3925897d6c"/>
-          <w15:appearance w15:val="hidden"/>
-          <w:text/>
-        </w:sdtPr>
-        <w:sdtContent>
-          <w:r>
-            <w:t>h Party shall mutually indemnify, defend, and hold harmless the other Party from and against any and all claims, damages, losses, costs, and expenses (including reasonable attorneys' fees) arising out of or relating to any breach of this Agreement. The total liability under this section shall not exceed $500,0</w:t>
-          </w:r>
-        </w:sdtContent>
-      </w:sdt>
+      <w:r>
+        <w:t>h Party shall mutually indemnify, defend, and hold harmless the other Party from and against any and all claims, damages, losses, costs, and expenses (including reasonable attorneys' fees) arising out of or relating to any breach of this Agreement. The total liability under this section shall not exceed $500,0</w:t>
+      </w:r>
       <w:r>
         <w:t>00.</w:t>
       </w:r>
@@ -264,20 +209,9 @@
       </w:r>
     </w:p>
     <w:p>
-      <w:sdt>
-        <w:sdtPr>
-          <w:id w:val="1786192645"/>
-          <w:alias w:val="Anchored metadata"/>
-          <w:tag w:val="demo-finding-c3b7f4c2-e661-4a6b-b826-b275400b02ff"/>
-          <w15:appearance w15:val="hidden"/>
-          <w:text/>
-        </w:sdtPr>
-        <w:sdtContent>
-          <w:r>
-            <w:t>This Agreement constitutes the entire agreement between the Parties with respect to the subject matter hereof and supersede prior or contemporaneous agreements, whether written or oral. No amendment to this Agreement shall be effective unless made in writing and signed by both Parties.</w:t>
-          </w:r>
-        </w:sdtContent>
-      </w:sdt>
+      <w:r>
+        <w:t>This Agreement constitutes the entire agreement between the Parties with respect to the subject matter hereof and supersede prior or contemporaneous agreements, whether written or oral. No amendment to this Agreement shall be effective unless made in writing and signed by both Parties.</w:t>
+      </w:r>
     </w:p>
     <w:p/>
     <w:p>
@@ -12215,19 +12149,4 @@
   </a:objectDefaults>
   <a:extraClrSchemeLst/>
 </a:theme>
-</file>
-
-<file path=customXml/item1.xml><?xml version="1.0" encoding="utf-8"?>
-<refs xmlns="urn:superdoc:react-demo:findings">
-  <ref id="demo-finding-52401a5f-123f-43d6-959c-fe9e1550d6be" encoding="json">{"kind":"manual-test","label":"React demo selection","createdAt":"2026-08-17T17:39:18.005Z"}</ref>
-  <ref id="demo-finding-5e85d667-f45f-483e-b0ba-b417153a563b" encoding="json">{"kind":"manual-test","label":"React demo selection","createdAt":"2026-08-17T17:41:03.362Z"}</ref>
-  <ref id="demo-finding-6c05ce79-19e5-4e68-b221-2a296e0bfa96" encoding="json">{"kind":"manual-test","label":"React demo selection","createdAt":"2026-08-17T17:41:22.554Z"}</ref>
-  <ref id="demo-finding-c57f8f8b-602a-4194-a5c2-5f942d9e4d69" encoding="json">{"kind":"manual-test","label":"React demo selection","createdAt":"2026-08-17T17:45:27.033Z"}</ref>
-  <ref id="demo-finding-53b868e2-057d-40c0-9c5f-fe3925897d6c" encoding="json">{"kind":"manual-test","label":"React demo selection","createdAt":"2026-08-17T17:45:48.996Z"}</ref>
-  <ref id="demo-finding-c3b7f4c2-e661-4a6b-b826-b275400b02ff" encoding="json">{"kind":"manual-test","label":"React demo selection","createdAt":"2026-08-17T17:45:55.825Z"}</ref>
-</refs>
-</file>
-
-<file path=customXml/itemProps1.xml><?xml version="1.0" encoding="utf-8"?>
-<ds:datastoreItem xmlns:ds="http://schemas.openxmlformats.org/officeDocument/2006/customXml" ds:itemID="{CD44BF95-29D8-2195-B5E3-2AF1C60111B3}"/>
 </file>
</xml_diff>